<commit_message>
Retire the 1 Oct per-track colleague sharing: /share pages and routes, review panel share box, Request to share on contacts, artist Allow/Decline on receipts, consent finalising jobs, the plan's colleague-download setting; the sharing switch now turns on only collection share links; older tracks are never shared; old tables kept (to drop later); docs and brief updated
Co-Authored-By: Claude Opus 5.5 <noreply@anthropic.com>
</commit_message>
<xml_diff>
--- a/docs/legal/FloorTest-Labs-sharing-brief-2026-10-11.docx
+++ b/docs/legal/FloorTest-Labs-sharing-brief-2026-10-11.docx
@@ -1013,7 +1013,7 @@
               <w:pStyle w:val="TableText"/>
             </w:pPr>
             <w:r>
-              <w:t xml:space="preserve">Today: nothing about share-link activity (see S9).</w:t>
+              <w:t xml:space="preserve">Today: nothing about share-link activity (see S9). They can stop private sharing of their track from their receipt at any time.</w:t>
             </w:r>
           </w:p>
         </w:tc>
@@ -1495,10 +1495,10 @@
         <w:rPr>
           <w:b/>
         </w:rPr>
-        <w:t xml:space="preserve">Senders can't yet withdraw sharing for a track.</w:t>
-      </w:r>
-      <w:r>
-        <w:t xml:space="preserve"> We can add it if you advise it (S12).</w:t>
+        <w:t xml:space="preserve">Senders can now stop sharing a track</w:t>
+      </w:r>
+      <w:r>
+        <w:t xml:space="preserve"> from their receipt (built 11 Oct; see S12 for wording).</w:t>
       </w:r>
     </w:p>
     <w:p>
@@ -1552,7 +1552,7 @@
         <w:t xml:space="preserve">Private sharing.</w:t>
       </w:r>
       <w:r>
-        <w:t xml:space="preserve"> If the receiver's collection allows private sharing when you send, the receiver may let people they choose hear your track through a private FloorTest link. These can be people they add by email address, by company email domain or by FloorTest username, and people who ask and are approved. Each person must confirm their email address and accept FloorTest's rules before listening. The receiver decides whether each person can only listen or can also download the original file, and for how long (up to 90 days, or until the receiver ends it). Private sharing never makes your track public. Nobody given access may release, sell, distribute, upload or publish it without a signed agreement with you. The receiver can end anyone's access at any time. Tracks you sent before [date] are only shared this way if you agree to it for that track.</w:t>
+        <w:t xml:space="preserve"> If the receiver's collection allows private sharing when you send, the receiver may let people they choose hear your track through a private FloorTest link. These can be people they add by email address, by company email domain or by FloorTest username, and people who ask and are approved. Each person must confirm their email address and accept FloorTest's rules before listening. The receiver decides whether each person can only listen or can also download the original file, and for how long (up to 90 days, or until the receiver ends it). Private sharing never makes your track public. Nobody given access may release, sell, distribute, upload or publish it without a signed agreement with you. The receiver can end anyone's access at any time. Tracks you sent before [date] are never shared this way.</w:t>
       </w:r>
     </w:p>
     <w:p>
@@ -2200,16 +2200,16 @@
         <w:t xml:space="preserve">S3. Tracks sent before the new wording.</w:t>
       </w:r>
       <w:r>
-        <w:t xml:space="preserve"> Those senders agreed to the 1 October model, which they were told was account holders only, 7 days, with download fixed by plan. We propose those tracks are </w:t>
-      </w:r>
-      <w:r>
-        <w:rPr>
-          <w:b/>
-        </w:rPr>
-        <w:t xml:space="preserve">not</w:t>
-      </w:r>
-      <w:r>
-        <w:t xml:space="preserve"> shared by the new links unless the sender agrees for that track. Please confirm.</w:t>
+        <w:t xml:space="preserve"> Those senders agreed to the 1 October model, which they were told was account holders only, 7 days, with download fixed by plan. We've built it so those tracks are </w:t>
+      </w:r>
+      <w:r>
+        <w:rPr>
+          <w:b/>
+        </w:rPr>
+        <w:t xml:space="preserve">never</w:t>
+      </w:r>
+      <w:r>
+        <w:t xml:space="preserve"> shared by the new links (the old per-track "ask the artist" flow was retired on 11 Oct). Please confirm, or tell us if a per-track consent route is worth rebuilding.</w:t>
       </w:r>
     </w:p>
     <w:p>

</xml_diff>